<commit_message>
Actualiza materiales y datos generados: ajustes en notas y transcripciones UnADM, imágenes y scripts de aulaTEX
</commit_message>
<xml_diff>
--- a/ITESCA/maestria-en-gestion-administrativa/seminario-i-mga/entregas-seminario-i/Tarea12_DeLaCruzMunoz.docx
+++ b/ITESCA/maestria-en-gestion-administrativa/seminario-i-mga/entregas-seminario-i/Tarea12_DeLaCruzMunoz.docx
@@ -3,12 +3,12 @@
 <w:document xmlns:wpc="http://schemas.microsoft.com/office/word/2010/wordprocessingCanvas" xmlns:cx="http://schemas.microsoft.com/office/drawing/2014/chartex" xmlns:cx1="http://schemas.microsoft.com/office/drawing/2015/9/8/chartex" xmlns:cx2="http://schemas.microsoft.com/office/drawing/2015/10/21/chartex" xmlns:cx3="http://schemas.microsoft.com/office/drawing/2016/5/9/chartex" xmlns:cx4="http://schemas.microsoft.com/office/drawing/2016/5/10/chartex" xmlns:cx5="http://schemas.microsoft.com/office/drawing/2016/5/11/chartex" xmlns:cx6="http://schemas.microsoft.com/office/drawing/2016/5/12/chartex" xmlns:cx7="http://schemas.microsoft.com/office/drawing/2016/5/13/chartex" xmlns:cx8="http://schemas.microsoft.com/office/drawing/2016/5/14/chartex" xmlns:mc="http://schemas.openxmlformats.org/markup-compatibility/2006" xmlns:aink="http://schemas.microsoft.com/office/drawing/2016/ink" xmlns:am3d="http://schemas.microsoft.com/office/drawing/2017/model3d" xmlns:o="urn:schemas-microsoft-com:office:office" xmlns:oel="http://schemas.microsoft.com/office/2019/extlst" xmlns:r="http://schemas.openxmlformats.org/officeDocument/2006/relationships" xmlns:m="http://schemas.openxmlformats.org/officeDocument/2006/math" xmlns:v="urn:schemas-microsoft-com:vml" xmlns:wp14="http://schemas.microsoft.com/office/word/2010/wordprocessingDrawing" xmlns:wp="http://schemas.openxmlformats.org/drawingml/2006/wordprocessingDrawing" xmlns:w10="urn:schemas-microsoft-com:office:word" xmlns:w="http://schemas.openxmlformats.org/wordprocessingml/2006/main" xmlns:w14="http://schemas.microsoft.com/office/word/2010/wordml" xmlns:w15="http://schemas.microsoft.com/office/word/2012/wordml" xmlns:w16cex="http://schemas.microsoft.com/office/word/2018/wordml/cex" xmlns:w16cid="http://schemas.microsoft.com/office/word/2016/wordml/cid" xmlns:w16="http://schemas.microsoft.com/office/word/2018/wordml" xmlns:w16sdtdh="http://schemas.microsoft.com/office/word/2020/wordml/sdtdatahash" xmlns:w16se="http://schemas.microsoft.com/office/word/2015/wordml/symex" xmlns:wpg="http://schemas.microsoft.com/office/word/2010/wordprocessingGroup" xmlns:wpi="http://schemas.microsoft.com/office/word/2010/wordprocessingInk" xmlns:wne="http://schemas.microsoft.com/office/word/2006/wordml" xmlns:wps="http://schemas.microsoft.com/office/word/2010/wordprocessingShape" mc:Ignorable="w14 w15 w16se w16cid w16 w16cex w16sdtdh wp14">
   <w:body>
     <w:p>
-      <w:pPr>
-        <w:spacing w:before="0" w:after="0"/>
-      </w:pPr>
-      <w:r>
+      <w:r>
+        <w:rPr>
+          <w:noProof/>
+        </w:rPr>
         <w:drawing>
-          <wp:anchor distT="0" distB="0" distL="0" distR="0" simplePos="0" relativeHeight="0" behindDoc="1" locked="1" layoutInCell="1" allowOverlap="1">
+          <wp:anchor distT="0" distB="0" distL="0" distR="0" simplePos="0" relativeHeight="251658240" behindDoc="1" locked="1" layoutInCell="1" allowOverlap="1" wp14:anchorId="48607FD2" wp14:editId="39146B8A">
             <wp:simplePos x="0" y="0"/>
             <wp:positionH relativeFrom="page">
               <wp:posOffset>0</wp:posOffset>
@@ -17,20 +17,21 @@
               <wp:posOffset>0</wp:posOffset>
             </wp:positionV>
             <wp:extent cx="7772400" cy="10058400"/>
+            <wp:effectExtent l="0" t="0" r="0" b="0"/>
             <wp:wrapNone/>
             <wp:docPr id="1" name="Picture 1"/>
-            <wp:cNvGraphicFramePr xmlns:a="http://schemas.openxmlformats.org/drawingml/2006/main">
-              <a:graphicFrameLocks noChangeAspect="1"/>
+            <wp:cNvGraphicFramePr>
+              <a:graphicFrameLocks xmlns:a="http://schemas.openxmlformats.org/drawingml/2006/main" noChangeAspect="1"/>
             </wp:cNvGraphicFramePr>
-            <a:graphic xmlns:a="http://schemas.openxmlformats.org/drawingml/2006/main" xmlns:pic="http://schemas.openxmlformats.org/drawingml/2006/picture">
+            <a:graphic xmlns:a="http://schemas.openxmlformats.org/drawingml/2006/main">
               <a:graphicData uri="http://schemas.openxmlformats.org/drawingml/2006/picture">
-                <pic:pic>
+                <pic:pic xmlns:pic="http://schemas.openxmlformats.org/drawingml/2006/picture">
                   <pic:nvPicPr>
                     <pic:cNvPr id="0" name="portada-t12.png"/>
                     <pic:cNvPicPr/>
                   </pic:nvPicPr>
                   <pic:blipFill>
-                    <a:blip r:embed="rId16"/>
+                    <a:blip r:embed="rId7"/>
                     <a:stretch>
                       <a:fillRect/>
                     </a:stretch>
@@ -40,7 +41,9 @@
                       <a:off x="0" y="0"/>
                       <a:ext cx="7772400" cy="10058400"/>
                     </a:xfrm>
-                    <a:prstGeom prst="rect"/>
+                    <a:prstGeom prst="rect">
+                      <a:avLst/>
+                    </a:prstGeom>
                   </pic:spPr>
                 </pic:pic>
               </a:graphicData>
@@ -82,7 +85,7 @@
       <w:r>
         <w:fldChar w:fldCharType="separate"/>
       </w:r>
-      <w:hyperlink w:anchor="_Toc242807289" w:history="1">
+      <w:hyperlink w:anchor="_Toc243177535" w:history="1">
         <w:r>
           <w:rPr>
             <w:rStyle w:val="Hipervnculo"/>
@@ -109,7 +112,7 @@
             <w:noProof/>
             <w:webHidden/>
           </w:rPr>
-          <w:instrText xml:space="preserve"> PAGEREF _Toc242807289 \h </w:instrText>
+          <w:instrText xml:space="preserve"> PAGEREF _Toc243177535 \h </w:instrText>
         </w:r>
         <w:r>
           <w:rPr>
@@ -154,7 +157,7 @@
           <w14:ligatures w14:val="standardContextual"/>
         </w:rPr>
       </w:pPr>
-      <w:hyperlink w:anchor="_Toc242807290" w:history="1">
+      <w:hyperlink w:anchor="_Toc243177536" w:history="1">
         <w:r>
           <w:rPr>
             <w:rStyle w:val="Hipervnculo"/>
@@ -181,7 +184,7 @@
             <w:noProof/>
             <w:webHidden/>
           </w:rPr>
-          <w:instrText xml:space="preserve"> PAGEREF _Toc242807290 \h </w:instrText>
+          <w:instrText xml:space="preserve"> PAGEREF _Toc243177536 \h </w:instrText>
         </w:r>
         <w:r>
           <w:rPr>
@@ -201,7 +204,7 @@
             <w:noProof/>
             <w:webHidden/>
           </w:rPr>
-          <w:t>8</w:t>
+          <w:t>9</w:t>
         </w:r>
         <w:r>
           <w:rPr>
@@ -226,7 +229,7 @@
           <w14:ligatures w14:val="standardContextual"/>
         </w:rPr>
       </w:pPr>
-      <w:hyperlink w:anchor="_Toc242807291" w:history="1">
+      <w:hyperlink w:anchor="_Toc243177537" w:history="1">
         <w:r>
           <w:rPr>
             <w:rStyle w:val="Hipervnculo"/>
@@ -253,7 +256,7 @@
             <w:noProof/>
             <w:webHidden/>
           </w:rPr>
-          <w:instrText xml:space="preserve"> PAGEREF _Toc242807291 \h </w:instrText>
+          <w:instrText xml:space="preserve"> PAGEREF _Toc243177537 \h </w:instrText>
         </w:r>
         <w:r>
           <w:rPr>
@@ -273,7 +276,7 @@
             <w:noProof/>
             <w:webHidden/>
           </w:rPr>
-          <w:t>8</w:t>
+          <w:t>9</w:t>
         </w:r>
         <w:r>
           <w:rPr>
@@ -298,7 +301,7 @@
           <w14:ligatures w14:val="standardContextual"/>
         </w:rPr>
       </w:pPr>
-      <w:hyperlink w:anchor="_Toc242807292" w:history="1">
+      <w:hyperlink w:anchor="_Toc243177538" w:history="1">
         <w:r>
           <w:rPr>
             <w:rStyle w:val="Hipervnculo"/>
@@ -325,7 +328,7 @@
             <w:noProof/>
             <w:webHidden/>
           </w:rPr>
-          <w:instrText xml:space="preserve"> PAGEREF _Toc242807292 \h </w:instrText>
+          <w:instrText xml:space="preserve"> PAGEREF _Toc243177538 \h </w:instrText>
         </w:r>
         <w:r>
           <w:rPr>
@@ -345,7 +348,7 @@
             <w:noProof/>
             <w:webHidden/>
           </w:rPr>
-          <w:t>10</w:t>
+          <w:t>11</w:t>
         </w:r>
         <w:r>
           <w:rPr>
@@ -370,7 +373,7 @@
           <w14:ligatures w14:val="standardContextual"/>
         </w:rPr>
       </w:pPr>
-      <w:hyperlink w:anchor="_Toc242807293" w:history="1">
+      <w:hyperlink w:anchor="_Toc243177539" w:history="1">
         <w:r>
           <w:rPr>
             <w:rStyle w:val="Hipervnculo"/>
@@ -397,7 +400,7 @@
             <w:noProof/>
             <w:webHidden/>
           </w:rPr>
-          <w:instrText xml:space="preserve"> PAGEREF _Toc242807293 \h </w:instrText>
+          <w:instrText xml:space="preserve"> PAGEREF _Toc243177539 \h </w:instrText>
         </w:r>
         <w:r>
           <w:rPr>
@@ -417,7 +420,7 @@
             <w:noProof/>
             <w:webHidden/>
           </w:rPr>
-          <w:t>11</w:t>
+          <w:t>12</w:t>
         </w:r>
         <w:r>
           <w:rPr>
@@ -442,7 +445,7 @@
           <w14:ligatures w14:val="standardContextual"/>
         </w:rPr>
       </w:pPr>
-      <w:hyperlink w:anchor="_Toc242807294" w:history="1">
+      <w:hyperlink w:anchor="_Toc243177540" w:history="1">
         <w:r>
           <w:rPr>
             <w:rStyle w:val="Hipervnculo"/>
@@ -469,7 +472,7 @@
             <w:noProof/>
             <w:webHidden/>
           </w:rPr>
-          <w:instrText xml:space="preserve"> PAGEREF _Toc242807294 \h </w:instrText>
+          <w:instrText xml:space="preserve"> PAGEREF _Toc243177540 \h </w:instrText>
         </w:r>
         <w:r>
           <w:rPr>
@@ -489,7 +492,7 @@
             <w:noProof/>
             <w:webHidden/>
           </w:rPr>
-          <w:t>11</w:t>
+          <w:t>12</w:t>
         </w:r>
         <w:r>
           <w:rPr>
@@ -514,7 +517,7 @@
           <w14:ligatures w14:val="standardContextual"/>
         </w:rPr>
       </w:pPr>
-      <w:hyperlink w:anchor="_Toc242807295" w:history="1">
+      <w:hyperlink w:anchor="_Toc243177541" w:history="1">
         <w:r>
           <w:rPr>
             <w:rStyle w:val="Hipervnculo"/>
@@ -541,7 +544,7 @@
             <w:noProof/>
             <w:webHidden/>
           </w:rPr>
-          <w:instrText xml:space="preserve"> PAGEREF _Toc242807295 \h </w:instrText>
+          <w:instrText xml:space="preserve"> PAGEREF _Toc243177541 \h </w:instrText>
         </w:r>
         <w:r>
           <w:rPr>
@@ -561,7 +564,7 @@
             <w:noProof/>
             <w:webHidden/>
           </w:rPr>
-          <w:t>12</w:t>
+          <w:t>13</w:t>
         </w:r>
         <w:r>
           <w:rPr>
@@ -586,7 +589,7 @@
           <w14:ligatures w14:val="standardContextual"/>
         </w:rPr>
       </w:pPr>
-      <w:hyperlink w:anchor="_Toc242807296" w:history="1">
+      <w:hyperlink w:anchor="_Toc243177542" w:history="1">
         <w:r>
           <w:rPr>
             <w:rStyle w:val="Hipervnculo"/>
@@ -613,7 +616,7 @@
             <w:noProof/>
             <w:webHidden/>
           </w:rPr>
-          <w:instrText xml:space="preserve"> PAGEREF _Toc242807296 \h </w:instrText>
+          <w:instrText xml:space="preserve"> PAGEREF _Toc243177542 \h </w:instrText>
         </w:r>
         <w:r>
           <w:rPr>
@@ -633,7 +636,7 @@
             <w:noProof/>
             <w:webHidden/>
           </w:rPr>
-          <w:t>12</w:t>
+          <w:t>13</w:t>
         </w:r>
         <w:r>
           <w:rPr>
@@ -658,7 +661,7 @@
           <w14:ligatures w14:val="standardContextual"/>
         </w:rPr>
       </w:pPr>
-      <w:hyperlink w:anchor="_Toc242807297" w:history="1">
+      <w:hyperlink w:anchor="_Toc243177543" w:history="1">
         <w:r>
           <w:rPr>
             <w:rStyle w:val="Hipervnculo"/>
@@ -685,7 +688,7 @@
             <w:noProof/>
             <w:webHidden/>
           </w:rPr>
-          <w:instrText xml:space="preserve"> PAGEREF _Toc242807297 \h </w:instrText>
+          <w:instrText xml:space="preserve"> PAGEREF _Toc243177543 \h </w:instrText>
         </w:r>
         <w:r>
           <w:rPr>
@@ -705,7 +708,7 @@
             <w:noProof/>
             <w:webHidden/>
           </w:rPr>
-          <w:t>13</w:t>
+          <w:t>14</w:t>
         </w:r>
         <w:r>
           <w:rPr>
@@ -730,7 +733,7 @@
           <w14:ligatures w14:val="standardContextual"/>
         </w:rPr>
       </w:pPr>
-      <w:hyperlink w:anchor="_Toc242807298" w:history="1">
+      <w:hyperlink w:anchor="_Toc243177544" w:history="1">
         <w:r>
           <w:rPr>
             <w:rStyle w:val="Hipervnculo"/>
@@ -757,7 +760,7 @@
             <w:noProof/>
             <w:webHidden/>
           </w:rPr>
-          <w:instrText xml:space="preserve"> PAGEREF _Toc242807298 \h </w:instrText>
+          <w:instrText xml:space="preserve"> PAGEREF _Toc243177544 \h </w:instrText>
         </w:r>
         <w:r>
           <w:rPr>
@@ -777,7 +780,7 @@
             <w:noProof/>
             <w:webHidden/>
           </w:rPr>
-          <w:t>13</w:t>
+          <w:t>14</w:t>
         </w:r>
         <w:r>
           <w:rPr>
@@ -802,7 +805,7 @@
           <w14:ligatures w14:val="standardContextual"/>
         </w:rPr>
       </w:pPr>
-      <w:hyperlink w:anchor="_Toc242807299" w:history="1">
+      <w:hyperlink w:anchor="_Toc243177545" w:history="1">
         <w:r>
           <w:rPr>
             <w:rStyle w:val="Hipervnculo"/>
@@ -829,7 +832,7 @@
             <w:noProof/>
             <w:webHidden/>
           </w:rPr>
-          <w:instrText xml:space="preserve"> PAGEREF _Toc242807299 \h </w:instrText>
+          <w:instrText xml:space="preserve"> PAGEREF _Toc243177545 \h </w:instrText>
         </w:r>
         <w:r>
           <w:rPr>
@@ -849,7 +852,7 @@
             <w:noProof/>
             <w:webHidden/>
           </w:rPr>
-          <w:t>14</w:t>
+          <w:t>15</w:t>
         </w:r>
         <w:r>
           <w:rPr>
@@ -874,7 +877,7 @@
           <w14:ligatures w14:val="standardContextual"/>
         </w:rPr>
       </w:pPr>
-      <w:hyperlink w:anchor="_Toc242807300" w:history="1">
+      <w:hyperlink w:anchor="_Toc243177546" w:history="1">
         <w:r>
           <w:rPr>
             <w:rStyle w:val="Hipervnculo"/>
@@ -901,7 +904,7 @@
             <w:noProof/>
             <w:webHidden/>
           </w:rPr>
-          <w:instrText xml:space="preserve"> PAGEREF _Toc242807300 \h </w:instrText>
+          <w:instrText xml:space="preserve"> PAGEREF _Toc243177546 \h </w:instrText>
         </w:r>
         <w:r>
           <w:rPr>
@@ -921,7 +924,7 @@
             <w:noProof/>
             <w:webHidden/>
           </w:rPr>
-          <w:t>15</w:t>
+          <w:t>16</w:t>
         </w:r>
         <w:r>
           <w:rPr>
@@ -946,7 +949,7 @@
           <w14:ligatures w14:val="standardContextual"/>
         </w:rPr>
       </w:pPr>
-      <w:hyperlink w:anchor="_Toc242807301" w:history="1">
+      <w:hyperlink w:anchor="_Toc243177547" w:history="1">
         <w:r>
           <w:rPr>
             <w:rStyle w:val="Hipervnculo"/>
@@ -973,7 +976,7 @@
             <w:noProof/>
             <w:webHidden/>
           </w:rPr>
-          <w:instrText xml:space="preserve"> PAGEREF _Toc242807301 \h </w:instrText>
+          <w:instrText xml:space="preserve"> PAGEREF _Toc243177547 \h </w:instrText>
         </w:r>
         <w:r>
           <w:rPr>
@@ -993,7 +996,7 @@
             <w:noProof/>
             <w:webHidden/>
           </w:rPr>
-          <w:t>15</w:t>
+          <w:t>17</w:t>
         </w:r>
         <w:r>
           <w:rPr>
@@ -1018,7 +1021,7 @@
           <w14:ligatures w14:val="standardContextual"/>
         </w:rPr>
       </w:pPr>
-      <w:hyperlink w:anchor="_Toc242807302" w:history="1">
+      <w:hyperlink w:anchor="_Toc243177548" w:history="1">
         <w:r>
           <w:rPr>
             <w:rStyle w:val="Hipervnculo"/>
@@ -1045,7 +1048,7 @@
             <w:noProof/>
             <w:webHidden/>
           </w:rPr>
-          <w:instrText xml:space="preserve"> PAGEREF _Toc242807302 \h </w:instrText>
+          <w:instrText xml:space="preserve"> PAGEREF _Toc243177548 \h </w:instrText>
         </w:r>
         <w:r>
           <w:rPr>
@@ -1065,7 +1068,7 @@
             <w:noProof/>
             <w:webHidden/>
           </w:rPr>
-          <w:t>16</w:t>
+          <w:t>18</w:t>
         </w:r>
         <w:r>
           <w:rPr>
@@ -1090,7 +1093,7 @@
           <w14:ligatures w14:val="standardContextual"/>
         </w:rPr>
       </w:pPr>
-      <w:hyperlink w:anchor="_Toc242807303" w:history="1">
+      <w:hyperlink w:anchor="_Toc243177549" w:history="1">
         <w:r>
           <w:rPr>
             <w:rStyle w:val="Hipervnculo"/>
@@ -1117,7 +1120,7 @@
             <w:noProof/>
             <w:webHidden/>
           </w:rPr>
-          <w:instrText xml:space="preserve"> PAGEREF _Toc242807303 \h </w:instrText>
+          <w:instrText xml:space="preserve"> PAGEREF _Toc243177549 \h </w:instrText>
         </w:r>
         <w:r>
           <w:rPr>
@@ -1137,7 +1140,7 @@
             <w:noProof/>
             <w:webHidden/>
           </w:rPr>
-          <w:t>17</w:t>
+          <w:t>20</w:t>
         </w:r>
         <w:r>
           <w:rPr>
@@ -1162,7 +1165,7 @@
           <w14:ligatures w14:val="standardContextual"/>
         </w:rPr>
       </w:pPr>
-      <w:hyperlink w:anchor="_Toc242807304" w:history="1">
+      <w:hyperlink w:anchor="_Toc243177550" w:history="1">
         <w:r>
           <w:rPr>
             <w:rStyle w:val="Hipervnculo"/>
@@ -1189,7 +1192,7 @@
             <w:noProof/>
             <w:webHidden/>
           </w:rPr>
-          <w:instrText xml:space="preserve"> PAGEREF _Toc242807304 \h </w:instrText>
+          <w:instrText xml:space="preserve"> PAGEREF _Toc243177550 \h </w:instrText>
         </w:r>
         <w:r>
           <w:rPr>
@@ -1209,7 +1212,7 @@
             <w:noProof/>
             <w:webHidden/>
           </w:rPr>
-          <w:t>17</w:t>
+          <w:t>20</w:t>
         </w:r>
         <w:r>
           <w:rPr>
@@ -1234,7 +1237,7 @@
           <w14:ligatures w14:val="standardContextual"/>
         </w:rPr>
       </w:pPr>
-      <w:hyperlink w:anchor="_Toc242807305" w:history="1">
+      <w:hyperlink w:anchor="_Toc243177551" w:history="1">
         <w:r>
           <w:rPr>
             <w:rStyle w:val="Hipervnculo"/>
@@ -1261,7 +1264,7 @@
             <w:noProof/>
             <w:webHidden/>
           </w:rPr>
-          <w:instrText xml:space="preserve"> PAGEREF _Toc242807305 \h </w:instrText>
+          <w:instrText xml:space="preserve"> PAGEREF _Toc243177551 \h </w:instrText>
         </w:r>
         <w:r>
           <w:rPr>
@@ -1281,7 +1284,7 @@
             <w:noProof/>
             <w:webHidden/>
           </w:rPr>
-          <w:t>19</w:t>
+          <w:t>21</w:t>
         </w:r>
         <w:r>
           <w:rPr>
@@ -1306,7 +1309,7 @@
           <w14:ligatures w14:val="standardContextual"/>
         </w:rPr>
       </w:pPr>
-      <w:hyperlink w:anchor="_Toc242807306" w:history="1">
+      <w:hyperlink w:anchor="_Toc243177552" w:history="1">
         <w:r>
           <w:rPr>
             <w:rStyle w:val="Hipervnculo"/>
@@ -1333,7 +1336,7 @@
             <w:noProof/>
             <w:webHidden/>
           </w:rPr>
-          <w:instrText xml:space="preserve"> PAGEREF _Toc242807306 \h </w:instrText>
+          <w:instrText xml:space="preserve"> PAGEREF _Toc243177552 \h </w:instrText>
         </w:r>
         <w:r>
           <w:rPr>
@@ -1353,7 +1356,7 @@
             <w:noProof/>
             <w:webHidden/>
           </w:rPr>
-          <w:t>19</w:t>
+          <w:t>22</w:t>
         </w:r>
         <w:r>
           <w:rPr>
@@ -1378,7 +1381,7 @@
           <w14:ligatures w14:val="standardContextual"/>
         </w:rPr>
       </w:pPr>
-      <w:hyperlink w:anchor="_Toc242807307" w:history="1">
+      <w:hyperlink w:anchor="_Toc243177553" w:history="1">
         <w:r>
           <w:rPr>
             <w:rStyle w:val="Hipervnculo"/>
@@ -1405,7 +1408,7 @@
             <w:noProof/>
             <w:webHidden/>
           </w:rPr>
-          <w:instrText xml:space="preserve"> PAGEREF _Toc242807307 \h </w:instrText>
+          <w:instrText xml:space="preserve"> PAGEREF _Toc243177553 \h </w:instrText>
         </w:r>
         <w:r>
           <w:rPr>
@@ -1425,7 +1428,7 @@
             <w:noProof/>
             <w:webHidden/>
           </w:rPr>
-          <w:t>20</w:t>
+          <w:t>23</w:t>
         </w:r>
         <w:r>
           <w:rPr>
@@ -1450,7 +1453,7 @@
           <w14:ligatures w14:val="standardContextual"/>
         </w:rPr>
       </w:pPr>
-      <w:hyperlink w:anchor="_Toc242807308" w:history="1">
+      <w:hyperlink w:anchor="_Toc243177554" w:history="1">
         <w:r>
           <w:rPr>
             <w:rStyle w:val="Hipervnculo"/>
@@ -1477,7 +1480,7 @@
             <w:noProof/>
             <w:webHidden/>
           </w:rPr>
-          <w:instrText xml:space="preserve"> PAGEREF _Toc242807308 \h </w:instrText>
+          <w:instrText xml:space="preserve"> PAGEREF _Toc243177554 \h </w:instrText>
         </w:r>
         <w:r>
           <w:rPr>
@@ -1497,7 +1500,7 @@
             <w:noProof/>
             <w:webHidden/>
           </w:rPr>
-          <w:t>23</w:t>
+          <w:t>25</w:t>
         </w:r>
         <w:r>
           <w:rPr>
@@ -1522,7 +1525,7 @@
           <w14:ligatures w14:val="standardContextual"/>
         </w:rPr>
       </w:pPr>
-      <w:hyperlink w:anchor="_Toc242807309" w:history="1">
+      <w:hyperlink w:anchor="_Toc243177555" w:history="1">
         <w:r>
           <w:rPr>
             <w:rStyle w:val="Hipervnculo"/>
@@ -1549,7 +1552,7 @@
             <w:noProof/>
             <w:webHidden/>
           </w:rPr>
-          <w:instrText xml:space="preserve"> PAGEREF _Toc242807309 \h </w:instrText>
+          <w:instrText xml:space="preserve"> PAGEREF _Toc243177555 \h </w:instrText>
         </w:r>
         <w:r>
           <w:rPr>
@@ -1569,7 +1572,7 @@
             <w:noProof/>
             <w:webHidden/>
           </w:rPr>
-          <w:t>23</w:t>
+          <w:t>25</w:t>
         </w:r>
         <w:r>
           <w:rPr>
@@ -1594,7 +1597,7 @@
           <w14:ligatures w14:val="standardContextual"/>
         </w:rPr>
       </w:pPr>
-      <w:hyperlink w:anchor="_Toc242807310" w:history="1">
+      <w:hyperlink w:anchor="_Toc243177556" w:history="1">
         <w:r>
           <w:rPr>
             <w:rStyle w:val="Hipervnculo"/>
@@ -1621,7 +1624,7 @@
             <w:noProof/>
             <w:webHidden/>
           </w:rPr>
-          <w:instrText xml:space="preserve"> PAGEREF _Toc242807310 \h </w:instrText>
+          <w:instrText xml:space="preserve"> PAGEREF _Toc243177556 \h </w:instrText>
         </w:r>
         <w:r>
           <w:rPr>
@@ -1641,7 +1644,7 @@
             <w:noProof/>
             <w:webHidden/>
           </w:rPr>
-          <w:t>23</w:t>
+          <w:t>25</w:t>
         </w:r>
         <w:r>
           <w:rPr>
@@ -1666,7 +1669,7 @@
           <w14:ligatures w14:val="standardContextual"/>
         </w:rPr>
       </w:pPr>
-      <w:hyperlink w:anchor="_Toc242807311" w:history="1">
+      <w:hyperlink w:anchor="_Toc243177557" w:history="1">
         <w:r>
           <w:rPr>
             <w:rStyle w:val="Hipervnculo"/>
@@ -1693,7 +1696,7 @@
             <w:noProof/>
             <w:webHidden/>
           </w:rPr>
-          <w:instrText xml:space="preserve"> PAGEREF _Toc242807311 \h </w:instrText>
+          <w:instrText xml:space="preserve"> PAGEREF _Toc243177557 \h </w:instrText>
         </w:r>
         <w:r>
           <w:rPr>
@@ -1713,7 +1716,7 @@
             <w:noProof/>
             <w:webHidden/>
           </w:rPr>
-          <w:t>23</w:t>
+          <w:t>25</w:t>
         </w:r>
         <w:r>
           <w:rPr>
@@ -1738,7 +1741,7 @@
           <w14:ligatures w14:val="standardContextual"/>
         </w:rPr>
       </w:pPr>
-      <w:hyperlink w:anchor="_Toc242807312" w:history="1">
+      <w:hyperlink w:anchor="_Toc243177558" w:history="1">
         <w:r>
           <w:rPr>
             <w:rStyle w:val="Hipervnculo"/>
@@ -1765,7 +1768,7 @@
             <w:noProof/>
             <w:webHidden/>
           </w:rPr>
-          <w:instrText xml:space="preserve"> PAGEREF _Toc242807312 \h </w:instrText>
+          <w:instrText xml:space="preserve"> PAGEREF _Toc243177558 \h </w:instrText>
         </w:r>
         <w:r>
           <w:rPr>
@@ -1785,7 +1788,7 @@
             <w:noProof/>
             <w:webHidden/>
           </w:rPr>
-          <w:t>23</w:t>
+          <w:t>25</w:t>
         </w:r>
         <w:r>
           <w:rPr>
@@ -1810,7 +1813,7 @@
           <w14:ligatures w14:val="standardContextual"/>
         </w:rPr>
       </w:pPr>
-      <w:hyperlink w:anchor="_Toc242807313" w:history="1">
+      <w:hyperlink w:anchor="_Toc243177559" w:history="1">
         <w:r>
           <w:rPr>
             <w:rStyle w:val="Hipervnculo"/>
@@ -1837,7 +1840,7 @@
             <w:noProof/>
             <w:webHidden/>
           </w:rPr>
-          <w:instrText xml:space="preserve"> PAGEREF _Toc242807313 \h </w:instrText>
+          <w:instrText xml:space="preserve"> PAGEREF _Toc243177559 \h </w:instrText>
         </w:r>
         <w:r>
           <w:rPr>
@@ -1857,7 +1860,7 @@
             <w:noProof/>
             <w:webHidden/>
           </w:rPr>
-          <w:t>23</w:t>
+          <w:t>25</w:t>
         </w:r>
         <w:r>
           <w:rPr>
@@ -1882,7 +1885,7 @@
           <w14:ligatures w14:val="standardContextual"/>
         </w:rPr>
       </w:pPr>
-      <w:hyperlink w:anchor="_Toc242807314" w:history="1">
+      <w:hyperlink w:anchor="_Toc243177560" w:history="1">
         <w:r>
           <w:rPr>
             <w:rStyle w:val="Hipervnculo"/>
@@ -1909,7 +1912,7 @@
             <w:noProof/>
             <w:webHidden/>
           </w:rPr>
-          <w:instrText xml:space="preserve"> PAGEREF _Toc242807314 \h </w:instrText>
+          <w:instrText xml:space="preserve"> PAGEREF _Toc243177560 \h </w:instrText>
         </w:r>
         <w:r>
           <w:rPr>
@@ -1929,7 +1932,7 @@
             <w:noProof/>
             <w:webHidden/>
           </w:rPr>
-          <w:t>24</w:t>
+          <w:t>26</w:t>
         </w:r>
         <w:r>
           <w:rPr>
@@ -1954,7 +1957,7 @@
           <w14:ligatures w14:val="standardContextual"/>
         </w:rPr>
       </w:pPr>
-      <w:hyperlink w:anchor="_Toc242807315" w:history="1">
+      <w:hyperlink w:anchor="_Toc243177561" w:history="1">
         <w:r>
           <w:rPr>
             <w:rStyle w:val="Hipervnculo"/>
@@ -1981,7 +1984,7 @@
             <w:noProof/>
             <w:webHidden/>
           </w:rPr>
-          <w:instrText xml:space="preserve"> PAGEREF _Toc242807315 \h </w:instrText>
+          <w:instrText xml:space="preserve"> PAGEREF _Toc243177561 \h </w:instrText>
         </w:r>
         <w:r>
           <w:rPr>
@@ -2001,7 +2004,7 @@
             <w:noProof/>
             <w:webHidden/>
           </w:rPr>
-          <w:t>27</w:t>
+          <w:t>30</w:t>
         </w:r>
         <w:r>
           <w:rPr>
@@ -2026,7 +2029,7 @@
           <w14:ligatures w14:val="standardContextual"/>
         </w:rPr>
       </w:pPr>
-      <w:hyperlink w:anchor="_Toc242807316" w:history="1">
+      <w:hyperlink w:anchor="_Toc243177562" w:history="1">
         <w:r>
           <w:rPr>
             <w:rStyle w:val="Hipervnculo"/>
@@ -2053,7 +2056,7 @@
             <w:noProof/>
             <w:webHidden/>
           </w:rPr>
-          <w:instrText xml:space="preserve"> PAGEREF _Toc242807316 \h </w:instrText>
+          <w:instrText xml:space="preserve"> PAGEREF _Toc243177562 \h </w:instrText>
         </w:r>
         <w:r>
           <w:rPr>
@@ -2073,7 +2076,7 @@
             <w:noProof/>
             <w:webHidden/>
           </w:rPr>
-          <w:t>28</w:t>
+          <w:t>31</w:t>
         </w:r>
         <w:r>
           <w:rPr>
@@ -2098,7 +2101,7 @@
           <w14:ligatures w14:val="standardContextual"/>
         </w:rPr>
       </w:pPr>
-      <w:hyperlink w:anchor="_Toc242807317" w:history="1">
+      <w:hyperlink w:anchor="_Toc243177563" w:history="1">
         <w:r>
           <w:rPr>
             <w:rStyle w:val="Hipervnculo"/>
@@ -2125,7 +2128,7 @@
             <w:noProof/>
             <w:webHidden/>
           </w:rPr>
-          <w:instrText xml:space="preserve"> PAGEREF _Toc242807317 \h </w:instrText>
+          <w:instrText xml:space="preserve"> PAGEREF _Toc243177563 \h </w:instrText>
         </w:r>
         <w:r>
           <w:rPr>
@@ -2145,7 +2148,7 @@
             <w:noProof/>
             <w:webHidden/>
           </w:rPr>
-          <w:t>31</w:t>
+          <w:t>34</w:t>
         </w:r>
         <w:r>
           <w:rPr>
@@ -2170,7 +2173,7 @@
         <w:pageBreakBefore/>
         <w:spacing w:before="120" w:after="80"/>
       </w:pPr>
-      <w:bookmarkStart w:id="0" w:name="_Toc242807289"/>
+      <w:bookmarkStart w:id="0" w:name="_Toc243177535"/>
       <w:r>
         <w:lastRenderedPageBreak/>
         <w:t>1 Antecedentes</w:t>
@@ -2271,6 +2274,26 @@
       </w:r>
     </w:p>
     <w:p>
+      <w:r>
+        <w:t>En México, Lamas Flores y Acosta Reveles (2025) estudian las estrategias de cabildeo de plataformas de transporte y reparto desde un enfoque cualitativo y analítico. Combinan seguimiento de etiquetas de Twitter entre 2015 y 2018, revisión hemerográfica y entrevistas semiestructuradas a un integrante de cada una de dos organizaciones de conductores y repartidores. Las autoras identifican acciones mediante medios de comunicación, redes sociales y movilización de apoyos con recursos jurisdiccionales para influ</w:t>
+      </w:r>
+      <w:r>
+        <w:t xml:space="preserve">ir en la regulación. Este antecedente muestra la importancia del entorno institucional y de distinguir la información </w:t>
+      </w:r>
+      <w:r>
+        <w:lastRenderedPageBreak/>
+        <w:t>empresarial de la evidencia verificable; no mide controles internos de vTaxi ni permite generalizar a todas las plataformas mexicanas.</w:t>
+      </w:r>
+    </w:p>
+    <w:p>
+      <w:r>
+        <w:t>La diferencia del presente caso es su escala organizacional: examina la correspondencia entre controles de gestión y preparación de documentos de una plataforma para taxis concesionados en Monterrey. El estudio de Lamas Flores y Acosta Reveles (2025) aporta contexto mexicano sobre formación y controversia de reglas, mientras Parker y Nielsen (2009) orientan la distinción entre sistemas formales y gestión práctica. Ninguno sustituye el diagnóstico del expediente. La aportación propuesta consiste en hacer tra</w:t>
+      </w:r>
+      <w:r>
+        <w:t>zable cada requisito aplicable, responsable, evidencia y observación, sin atribuir a vTaxi prácticas de las empresas estudiadas ni trasladarles sus resultados.</w:t>
+      </w:r>
+    </w:p>
+    <w:p>
       <w:pPr>
         <w:keepNext/>
         <w:ind w:firstLine="0"/>
@@ -2289,7 +2312,6 @@
     </w:p>
     <w:p>
       <w:r>
-        <w:lastRenderedPageBreak/>
         <w:t>También persiste un límite de transferencia. Las asociaciones identificadas en otros países o en muestras de empresas mexicanas no acreditan la situación jurídica de una plataforma individual. Se requiere un diagnóstico del caso que contraste documentos internos, modelo de servicio y fuentes oficiales. La cuestión pendiente consiste en convertir información preliminar en una secuencia comprobable de decisiones, responsables y evidencias, manteniendo separados los requisitos confirmados, las recomendaciones y los aspectos todavía sujetos a aclaración.</w:t>
       </w:r>
     </w:p>
@@ -2302,6 +2324,7 @@
         <w:rPr>
           <w:b/>
         </w:rPr>
+        <w:lastRenderedPageBreak/>
         <w:t>Pertinencia del estudio</w:t>
       </w:r>
     </w:p>
@@ -2329,7 +2352,7 @@
     </w:p>
     <w:p>
       <w:r>
-        <w:t>Los antecedentes muestran la conveniencia de vincular tecnología y capacidades de gestión. En vTaxi, el siguiente paso consiste en delimitar la brecha entre los borradores regulatorios disponibles y una preparación administrativa respaldada por evidencias. A partir de esa brecha, el planteamiento del problema examinará la relación entre la gestión del cumplimiento normativo y la preparación del proyecto para su formalización como plataforma de taxis concesionados en Nuevo León.</w:t>
+        <w:t>Los antecedentes muestran la conveniencia de vincular tecnología y capacidades de gestión. En vTaxi, el siguiente paso consiste en delimitar la brecha entre los borradores regulatorios disponibles y una preparación administrativa respaldada por evidencias. A partir de esa brecha, el planteamiento del problema examinará la relación entre la gestión del cumplimiento normativo y la preparación del proyecto para su formalización como plataforma de taxis concesionados en Monterrey, Nuevo León.</w:t>
       </w:r>
     </w:p>
     <w:p>
@@ -2338,7 +2361,7 @@
         <w:pageBreakBefore/>
         <w:spacing w:before="120" w:after="80"/>
       </w:pPr>
-      <w:bookmarkStart w:id="1" w:name="_Toc242807290"/>
+      <w:bookmarkStart w:id="1" w:name="_Toc243177536"/>
       <w:r>
         <w:lastRenderedPageBreak/>
         <w:t>2 Planteamiento del problema</w:t>
@@ -2355,7 +2378,7 @@
         <w:pStyle w:val="Ttulo2"/>
         <w:spacing w:before="240" w:after="80"/>
       </w:pPr>
-      <w:bookmarkStart w:id="2" w:name="_Toc242807291"/>
+      <w:bookmarkStart w:id="2" w:name="_Toc243177537"/>
       <w:r>
         <w:t>2.1 Enunciado del problema</w:t>
       </w:r>
@@ -2387,7 +2410,7 @@
     </w:p>
     <w:p>
       <w:r>
-        <w:t>La unidad de análisis será el proyecto vTaxi y su proceso de preparación administrativa. El ámbito espacial es Nuevo León y el periodo propuesto comprende septiembre a noviembre de 2026, con corte inicial de la revisión documental al 27 de septiembre. Se examinará principalmente el modelo de taxis concesionados. La modalidad SETIAP se utilizará como contraste para justificar la clasificación, sin extender el estudio a todas las plataformas de transporte ni prometer un registro gubernamental dentro de ese periodo.</w:t>
+        <w:t>La unidad de análisis será el proyecto vTaxi y su proceso de preparación administrativa. El ámbito espacial es el municipio de Monterrey, Nuevo León y el periodo propuesto comprende septiembre a noviembre de 2026, con corte inicial de la revisión documental al 27 de septiembre. Se examinará principalmente el modelo de taxis concesionados. La modalidad SETIAP se utilizará como contraste para justificar la clasificación, sin extender el estudio a todas las plataformas de transporte ni prometer un registro gubernamental dentro de ese periodo.</w:t>
       </w:r>
     </w:p>
     <w:p>
@@ -2400,7 +2423,7 @@
         <w:rPr>
           <w:b/>
         </w:rPr>
-        <w:t>Los borradores regulatorios de vTaxi no acreditan una ruta validada de requisitos, responsables y evidencias para su formalización como plataforma de taxis concesionados en Nuevo León.</w:t>
+        <w:t>Los borradores regulatorios de vTaxi no acreditan una ruta validada de requisitos, responsables y evidencias para su formalización como plataforma de taxis concesionados en Monterrey, Nuevo León.</w:t>
       </w:r>
     </w:p>
     <w:p>
@@ -2414,7 +2437,7 @@
         <w:pStyle w:val="Ttulo2"/>
         <w:spacing w:before="240" w:after="80"/>
       </w:pPr>
-      <w:bookmarkStart w:id="3" w:name="_Toc242807292"/>
+      <w:bookmarkStart w:id="3" w:name="_Toc243177538"/>
       <w:r>
         <w:t>2.2 Formulación del problema</w:t>
       </w:r>
@@ -2422,7 +2445,7 @@
     </w:p>
     <w:p>
       <w:r>
-        <w:t>¿Cómo se relaciona el nivel de gestión del cumplimiento normativo con el grado de preparación administrativa de vTaxi para su formalización como plataforma de taxis concesionados en Nuevo León durante septiembre a noviembre de 2026?</w:t>
+        <w:t>¿Cómo se relaciona el nivel de gestión del cumplimiento normativo con el grado de preparación administrativa de vTaxi para su formalización como plataforma de taxis concesionados en Monterrey, Nuevo León durante septiembre a noviembre de 2026?</w:t>
       </w:r>
     </w:p>
     <w:p>
@@ -2440,7 +2463,7 @@
         <w:pStyle w:val="Ttulo2"/>
         <w:spacing w:before="240" w:after="80"/>
       </w:pPr>
-      <w:bookmarkStart w:id="4" w:name="_Toc242807293"/>
+      <w:bookmarkStart w:id="4" w:name="_Toc243177539"/>
       <w:r>
         <w:lastRenderedPageBreak/>
         <w:t>2.3 Preguntas específicas</w:t>
@@ -2484,7 +2507,7 @@
         <w:pStyle w:val="Ttulo1"/>
         <w:spacing w:before="120" w:after="80"/>
       </w:pPr>
-      <w:bookmarkStart w:id="5" w:name="_Toc242807294"/>
+      <w:bookmarkStart w:id="5" w:name="_Toc243177540"/>
       <w:r>
         <w:t>3 Formulación de objetivos general y específicos</w:t>
       </w:r>
@@ -2506,7 +2529,7 @@
         <w:pStyle w:val="Ttulo2"/>
         <w:spacing w:before="120" w:after="80"/>
       </w:pPr>
-      <w:bookmarkStart w:id="6" w:name="_Toc242807295"/>
+      <w:bookmarkStart w:id="6" w:name="_Toc243177541"/>
       <w:r>
         <w:lastRenderedPageBreak/>
         <w:t>3.1 Objetivo general</w:t>
@@ -2518,7 +2541,7 @@
         <w:keepLines/>
       </w:pPr>
       <w:r>
-        <w:t>Analizar la relación entre el nivel de gestión del cumplimiento normativo y el grado de preparación administrativa de vTaxi para su formalización como plataforma de taxis concesionados en Nuevo León durante septiembre a noviembre de 2026, mediante el contraste documental de requisitos, responsabilidades y evidencias del proyecto.</w:t>
+        <w:t>Analizar la relación entre el nivel de gestión del cumplimiento normativo y el grado de preparación administrativa de vTaxi para su formalización como plataforma de taxis concesionados en Monterrey, Nuevo León durante septiembre a noviembre de 2026, mediante el contraste documental de requisitos, responsabilidades y evidencias del proyecto.</w:t>
       </w:r>
     </w:p>
     <w:p>
@@ -2526,7 +2549,7 @@
         <w:pStyle w:val="Ttulo2"/>
         <w:spacing w:before="120" w:after="80"/>
       </w:pPr>
-      <w:bookmarkStart w:id="7" w:name="_Toc242807296"/>
+      <w:bookmarkStart w:id="7" w:name="_Toc243177542"/>
       <w:r>
         <w:t>3.2 Objetivos específicos</w:t>
       </w:r>
@@ -2589,7 +2612,7 @@
         <w:pStyle w:val="Ttulo1"/>
         <w:spacing w:before="120" w:after="80"/>
       </w:pPr>
-      <w:bookmarkStart w:id="8" w:name="_Toc242807297"/>
+      <w:bookmarkStart w:id="8" w:name="_Toc243177543"/>
       <w:r>
         <w:t>4 Justificación</w:t>
       </w:r>
@@ -2599,7 +2622,7 @@
       <w:pPr>
         <w:pStyle w:val="Ttulo2"/>
       </w:pPr>
-      <w:bookmarkStart w:id="9" w:name="_Toc242807298"/>
+      <w:bookmarkStart w:id="9" w:name="_Toc243177544"/>
       <w:r>
         <w:t>4.1 Relevancia teórica</w:t>
       </w:r>
@@ -2613,14 +2636,25 @@
     <w:p>
       <w:r>
         <w:lastRenderedPageBreak/>
-        <w:t>El objetivo general de Tarea 10 concreta esa relación en vTaxi, como proyecto de plataforma de taxis concesionados en Nuevo León, durante septiembre a noviembre de 2026. Sus categorías analíticas son la asignación de responsables, la verificación de requisitos y el seguimiento documental, contrastadas con la integridad del expediente y la atención de observaciones internas. La contribución esperada es una lectura trazable del caso que permita distinguir requisitos identificados, evidencias disponibles y controles propuestos. No se plantea validar un modelo causal ni generalizar resultados de un solo proyecto a todo el sector.</w:t>
+        <w:t>El objetivo general de Tarea 10 concreta esa relación en vTaxi, como proyecto de plataforma de taxis concesionados en Monterrey, Nuevo León, durante septiembre a noviembre de 2026. Sus categorías analíticas son la asignación de responsables, la verificación de requisitos y el seguimiento documental, contrastadas con la integridad del expediente y la atención de observaciones internas. La contribución esperada es una lectura trazable del caso que permita distinguir requisitos identificados, evidencias disponibles y controles propuestos. No se plantea validar un modelo causal ni generalizar resultados de un solo proyecto a todo el sector.</w:t>
+      </w:r>
+    </w:p>
+    <w:p>
+      <w:r>
+        <w:t xml:space="preserve">El enfoque conceptual distingue adopción formal, gestión práctica y preparación documental. Parker y Nielsen (2009), con el alcance de resumen editorial señalado en los </w:t>
+      </w:r>
+      <w:r>
+        <w:t>antecedentes, permiten separar la presencia de un sistema de cumplimiento de su administración efectiva. OECD (2018, p. 39) orienta la atención hacia registros actualizados, gestión de casos y flujos de trabajo en organismos de supervisión; su aplicación a vTaxi es analítica, no una obligación adicional impuesta al proyecto. El mecanismo propuesto es que identificar responsables y revisar requisitos facilita detectar y atender brechas; la integridad del documento resultante se evalúa por separado. La comple</w:t>
+      </w:r>
+      <w:r>
+        <w:t>jidad del requisito y el acceso a información pueden explicar divergencias. Así, X describe controles observables y Y describe calidad del expediente, sin definir una variable mediante la otra ni anticipar causalidad.</w:t>
       </w:r>
     </w:p>
     <w:p>
       <w:pPr>
         <w:pStyle w:val="Ttulo2"/>
       </w:pPr>
-      <w:bookmarkStart w:id="10" w:name="_Toc242807299"/>
+      <w:bookmarkStart w:id="10" w:name="_Toc243177545"/>
       <w:r>
         <w:t>4.2 Relevancia práctica</w:t>
       </w:r>
@@ -2633,89 +2667,116 @@
     </w:p>
     <w:p>
       <w:r>
+        <w:lastRenderedPageBreak/>
         <w:t>Los objetivos específicos definen cuatro productos coherentes con esa utilidad: un catálogo de requisitos por modalidad y autoridad; un diagnóstico de brechas; una matriz de contraste entre controles y estado del expediente; y una ruta priorizada de atención. Un escenario de aplicación sería detectar que una afirmación de un borrador carece de fuente o documento de respaldo y asignar su comprobación antes de usarla en una solicitud. Otro sería separar la capacitación de conductores de la autorización de la plataforma. Los indicadores propuestos —cobertura de responsabilidades y cierre documentado de observaciones— se calcularían con denominadores y criterios explícitos; no se presentan valores obtenidos ni ahorros financieros demostrados.</w:t>
       </w:r>
     </w:p>
     <w:p>
       <w:r>
-        <w:t xml:space="preserve">La delimitación actual del caso es Monterrey, Nuevo León, por indicación del estudiante. El municipio no se equipara automáticamente con el área metropolitana ni con toda la entidad. </w:t>
+        <w:t>La delimitación actual del caso es Monterrey, Nuevo León, por indicación del estudiante. El municipio no se equipara automáticamente con el área metropolitana ni con toda la entidad. Los Censos Económicos 2024 y el Censo de Población y Vivienda 2020 del INEGI constituyen fuentes para contextualizar establecimientos y población, pero los datos agregados del portal no se presentan como cifras municipales ni como demanda validada de vTaxi. La ley de movilidad de Nuevo León corresponde al ámbito normativo estatal. Los antecedentes de Cajeme se conservan como referencias históricas, no como evidencia empírica del caso de Monterrey.</w:t>
+      </w:r>
+    </w:p>
+    <w:p>
+      <w:pPr>
+        <w:pStyle w:val="Ttulo2"/>
+      </w:pPr>
+      <w:bookmarkStart w:id="11" w:name="_Toc243177546"/>
+      <w:r>
+        <w:t>4.3 Relevancia social e institucional</w:t>
+      </w:r>
+      <w:bookmarkEnd w:id="11"/>
+    </w:p>
+    <w:p>
+      <w:r>
+        <w:t>Los beneficiarios directos potenciales son las personas responsables de la preparación y revisión administrativa del proyecto vTaxi. Una documentación ordenada podría facilitar la coordinación y evitar que propuestas internas se comuniquen como permisos o requisitos oficiales. Los conductores vinculados al proyecto serían beneficiarios indirectos potenciales de información más clara sobre funciones y documentación, pero el estudio no acredita su participación, la existencia de concesiones de vTaxi ni una autorización operativa.</w:t>
+      </w:r>
+    </w:p>
+    <w:p>
+      <w:r>
+        <w:t xml:space="preserve">En el ámbito institucional, el caso permite aplicar competencias de la MGA: delimitar un problema organizacional, construir criterios de análisis, identificar evidencia y argumentar </w:t>
       </w:r>
       <w:r>
         <w:lastRenderedPageBreak/>
-        <w:t>Los Censos Económicos 2024 y el Censo de Población y Vivienda 2020 del INEGI constituyen fuentes para contextualizar establecimientos y población, pero los datos agregados del portal no se presentan como cifras municipales ni como demanda validada de vTaxi. La ley de movilidad de Nuevo León corresponde al ámbito normativo estatal. Los antecedentes de Cajeme se conservan como referencias históricas, no como evidencia empírica del caso de Monterrey.</w:t>
+        <w:t>decisiones responsables. La distinción entre taxis concesionados y transporte privado mediante empresas de redes de transporte debe sostenerse en fuentes aplicables, como la ley estatal consultada, y no en analogías automáticas (H. Congreso del Estado de Nuevo León, 2026). El impacto se limita a la calidad de la preparación administrativa evaluable; no se promete seguridad vial, empleo, aprobación gubernamental o beneficio comunitario que el diseño documental no puede demostrar.</w:t>
       </w:r>
     </w:p>
     <w:p>
       <w:pPr>
         <w:pStyle w:val="Ttulo2"/>
       </w:pPr>
-      <w:bookmarkStart w:id="11" w:name="_Toc242807300"/>
-      <w:r>
-        <w:t>4.3 Relevancia social e institucional</w:t>
-      </w:r>
-      <w:bookmarkEnd w:id="11"/>
-    </w:p>
-    <w:p>
-      <w:r>
-        <w:t>Los beneficiarios directos potenciales son las personas responsables de la preparación y revisión administrativa del proyecto vTaxi. Una documentación ordenada podría facilitar la coordinación y evitar que propuestas internas se comuniquen como permisos o requisitos oficiales. Los conductores vinculados al proyecto serían beneficiarios indirectos potenciales de información más clara sobre funciones y documentación, pero el estudio no acredita su participación, la existencia de concesiones de vTaxi ni una autorización operativa.</w:t>
-      </w:r>
-    </w:p>
-    <w:p>
-      <w:r>
-        <w:t>En el ámbito institucional, el caso permite aplicar competencias de la MGA: delimitar un problema organizacional, construir criterios de análisis, identificar evidencia y argumentar decisiones responsables. La distinción entre taxis concesionados y transporte privado mediante empresas de redes de transporte debe sostenerse en fuentes aplicables, como la ley estatal consultada, y no en analogías automáticas (H. Congreso del Estado de Nuevo León, 2026). El impacto se limita a la calidad de la preparación administrativa evaluable; no se promete seguridad vial, empleo, aprobación gubernamental o beneficio comunitario que el diseño documental no puede demostrar.</w:t>
+      <w:bookmarkStart w:id="12" w:name="_Toc243177547"/>
+      <w:r>
+        <w:t>4.4 Originalidad</w:t>
+      </w:r>
+      <w:bookmarkEnd w:id="12"/>
+    </w:p>
+    <w:p>
+      <w:r>
+        <w:t>La originalidad propuesta es contextual y operativa: integrar la clasificación de requisitos por modalidad, el examen de borradores y la trazabilidad de responsabilidades en un mismo diagnóstico de preparación administrativa. Los diez antecedentes científicos de Tarea 3 proporcionan referencias sobre transformación digital e innovación en MiPyMEs; no se sustituyen por nuevos estudios ni se asume que investiguen exactamente plataformas de taxis en Nuevo León. Parker y Nielsen (2009) aportan un antecedente conceptual sobre cumplimiento empresarial, utilizado con el alcance de resumen editorial documentado en la revisión previa, no como evidencia empírica local.</w:t>
+      </w:r>
+    </w:p>
+    <w:p>
+      <w:r>
+        <w:t>El valor agregado esperado frente a una simple recopilación normativa es vincular cada afirmación del expediente con su fuente, responsable propuesto, evidencia y condición de cierre. El vacío atendido es la falta de esa articulación en los componentes disponibles del caso, según el problema delimitado; no se sostiene que sea el primer estudio del tema ni que exista una ausencia universal de investigación. La novedad deberá evaluarse frente a la evidencia reunida y a la ampliación bibliográfica regional, que sigue pendiente.</w:t>
+      </w:r>
+    </w:p>
+    <w:p>
+      <w:r>
+        <w:t xml:space="preserve">Frente al antecedente mexicano de Lamas Flores y Acosta Reveles (2025), centrado en actores y estrategias de influencia regulatoria, la originalidad del caso reside en la evaluación interna de controles y calidad documental antes de una eventual formalización. La comparación precisa una diferencia de objeto, escala y evidencia; no constituye una afirmación de primacía ni agota la literatura sobre movilidad en México. La revisión deberá ampliarse conforme avance </w:t>
+      </w:r>
+      <w:r>
+        <w:lastRenderedPageBreak/>
+        <w:t>el estudio, en especial con trabajos directamente referidos a Monterrey y a taxis concesionados.</w:t>
       </w:r>
     </w:p>
     <w:p>
       <w:pPr>
         <w:pStyle w:val="Ttulo2"/>
       </w:pPr>
-      <w:bookmarkStart w:id="12" w:name="_Toc242807301"/>
-      <w:r>
-        <w:t>4.4 Originalidad</w:t>
-      </w:r>
-      <w:bookmarkEnd w:id="12"/>
-    </w:p>
-    <w:p>
-      <w:r>
-        <w:t xml:space="preserve">La originalidad propuesta es contextual y operativa: integrar la clasificación de requisitos por modalidad, el examen de borradores y la trazabilidad de responsabilidades en un mismo diagnóstico de preparación administrativa. Los diez antecedentes científicos de Tarea 3 proporcionan referencias sobre transformación digital e innovación en MiPyMEs; no se </w:t>
+      <w:bookmarkStart w:id="13" w:name="_Toc243177548"/>
+      <w:r>
+        <w:t>4.5 Viabilidad</w:t>
+      </w:r>
+      <w:bookmarkEnd w:id="13"/>
+    </w:p>
+    <w:p>
+      <w:r>
+        <w:t>La fase documental es realizable con los recursos locales comprobados: los antecedentes de Tareas 8–10, las matrices, las copias de borradores y los textos institucionales conservados. El material docente señala que la justificación debe argumentar tiempo, recursos, acceso, ética y limitaciones, no limitarse a afirmar que el tema es importante (Instituto Tecnológico Superior de Cajeme, s. f.-c). Para el periodo septiembre–noviembre de 2026 se propone utilizar lo ya recopilado en septiembre como línea de base y distribuir el trabajo restante en revisión de requisitos durante octubre, diagnóstico y contraste documental entre finales de octubre e inicios de noviembre, y priorización y revisión de resultados durante noviembre. Es una programación propuesta, no un registro de tareas ya realizadas.</w:t>
+      </w:r>
+    </w:p>
+    <w:p>
+      <w:r>
+        <w:t>La disponibilidad de las copias internas permite revisar su contenido, pero no demuestra autorización para entrevistar actores, acceder a expedientes completos o divulgar datos privados. Cualquier entrevista o incorporación de nuevos documentos quedará condicionada al consentimiento, autorización y disponibilidad de las personas responsables. Si no se obtiene ese acceso, el estudio se limitará al corpus documental autorizado, declarará sus faltantes y no inferirá el funcionamiento real de la empresa. No se requiere comprar software especializado para esta fase; se emplearán los procesadores de texto, hojas de cálculo y herramientas de consulta disponibles, sin afirmar un presupuesto aprobado ni compromisos de dedicación ajenos.</w:t>
+      </w:r>
+    </w:p>
+    <w:p>
+      <w:r>
+        <w:t xml:space="preserve">Los controles éticos comprenden minimizar datos personales, separar documentos de ejemplo de hechos confirmados, restringir el acceso a los archivos internos y citar fuentes sin redistribuir información sensible. Las limitaciones controlables son la trazabilidad de cada extracción, el registro de fecha de consulta, la revisión de coherencia y la identificación de afirmaciones no respaldadas. La vigencia normativa y la completitud del expediente son riesgos </w:t>
       </w:r>
       <w:r>
         <w:lastRenderedPageBreak/>
-        <w:t>sustituyen por nuevos estudios ni se asume que investiguen exactamente plataformas de taxis en Nuevo León. Parker y Nielsen (2009) aportan un antecedente conceptual sobre cumplimiento empresarial, utilizado con el alcance de resumen editorial documentado en la revisión previa, no como evidencia empírica local.</w:t>
-      </w:r>
-    </w:p>
-    <w:p>
-      <w:r>
-        <w:t>El valor agregado esperado frente a una simple recopilación normativa es vincular cada afirmación del expediente con su fuente, responsable propuesto, evidencia y condición de cierre. El vacío atendido es la falta de esa articulación en los componentes disponibles del caso, según el problema delimitado; no se sostiene que sea el primer estudio del tema ni que exista una ausencia universal de investigación. La novedad deberá evaluarse frente a la evidencia reunida y a la ampliación bibliográfica regional, que sigue pendiente.</w:t>
-      </w:r>
-    </w:p>
-    <w:p>
-      <w:pPr>
-        <w:pStyle w:val="Ttulo2"/>
-      </w:pPr>
-      <w:bookmarkStart w:id="13" w:name="_Toc242807302"/>
-      <w:r>
-        <w:t>4.5 Viabilidad</w:t>
-      </w:r>
-      <w:bookmarkEnd w:id="13"/>
-    </w:p>
-    <w:p>
-      <w:r>
-        <w:t>La fase documental es realizable con los recursos locales comprobados: los antecedentes de Tareas 8–10, las matrices, las copias de borradores y los textos institucionales conservados. El material docente señala que la justificación debe argumentar tiempo, recursos, acceso, ética y limitaciones, no limitarse a afirmar que el tema es importante (Instituto Tecnológico Superior de Cajeme, s. f.-c). Para el periodo septiembre–noviembre de 2026 se propone utilizar lo ya recopilado en septiembre como línea de base y distribuir el trabajo restante en revisión de requisitos durante octubre, diagnóstico y contraste documental entre finales de octubre e inicios de noviembre, y priorización y revisión de resultados durante noviembre. Es una programación propuesta, no un registro de tareas ya realizadas.</w:t>
-      </w:r>
-    </w:p>
-    <w:p>
-      <w:r>
-        <w:t xml:space="preserve">La disponibilidad de las copias internas permite revisar su contenido, pero no demuestra autorización para entrevistar actores, acceder a expedientes completos o divulgar datos privados. Cualquier entrevista o incorporación de nuevos documentos quedará condicionada al consentimiento, autorización y disponibilidad de las personas responsables. Si no se obtiene ese acceso, el estudio se limitará al corpus documental autorizado, declarará sus faltantes y no inferirá el funcionamiento real de la empresa. No se requiere comprar software especializado </w:t>
-      </w:r>
-      <w:r>
-        <w:lastRenderedPageBreak/>
-        <w:t>para esta fase; se emplearán los procesadores de texto, hojas de cálculo y herramientas de consulta disponibles, sin afirmar un presupuesto aprobado ni compromisos de dedicación ajenos.</w:t>
-      </w:r>
-    </w:p>
-    <w:p>
-      <w:r>
-        <w:t>Los controles éticos comprenden minimizar datos personales, separar documentos de ejemplo de hechos confirmados, restringir el acceso a los archivos internos y citar fuentes sin redistribuir información sensible. Las limitaciones controlables son la trazabilidad de cada extracción, el registro de fecha de consulta, la revisión de coherencia y la identificación de afirmaciones no respaldadas. La vigencia normativa y la completitud del expediente son riesgos que deben comprobarse durante la investigación; por ello, la factibilidad es suficiente para iniciar el análisis documental y condicionada para ampliar su alcance. La matriz mantiene preguntas y objetivos, sin una columna adicional de justificación, y el Covey conserva problema y objetivo general como prioridades importantes y no urgentes, sin nuevos elementos.</w:t>
+        <w:t>que deben comprobarse durante la investigación; por ello, la factibilidad es suficiente para iniciar el análisis documental y condicionada para ampliar su alcance. La matriz mantiene preguntas y objetivos, sin una columna adicional de justificación, y el Covey conserva problema y objetivo general como prioridades importantes y no urgentes, sin nuevos elementos.</w:t>
+      </w:r>
+    </w:p>
+    <w:p>
+      <w:r>
+        <w:t xml:space="preserve">El acceso se gestionará mediante una solicitud escrita al responsable autorizado del proyecto, con propósito, periodo y lista de documentos requeridos. La autorización deberá precisar qué versiones pueden consultarse, qué datos deben anonimizarse, quién tendrá acceso a las copias y qué extractos pueden incorporarse al informe. Se llevará un registro con solicitud, respuesta, alcance concedido y restricciones por documento. Los materiales no autorizados o no disponibles se clasificarán como no verificables; </w:t>
+      </w:r>
+      <w:r>
+        <w:t>no se interpretarán como incumplimientos ni se reemplazarán por registros ficticios.</w:t>
+      </w:r>
+    </w:p>
+    <w:p>
+      <w:r>
+        <w:t>Las entrevistas, si resultan necesarias, requerirán invitación y consentimiento individual separados del permiso documental. Se informarán finalidad, participación voluntaria, posibilidad de omitir respuestas o retirarse, uso de citas y condiciones de resguardo. La grabación exigirá consentimiento específico; sin él se utilizarán únicamente notas autorizadas. El plazo de conservación y la eliminación de archivos se acordarán antes de recopilar datos. Si no se obtienen permisos dentro del periodo, se mantend</w:t>
+      </w:r>
+      <w:r>
+        <w:t>rá el alcance documental autorizado y se reportarán las limitaciones sin atribuir testimonios ni verificaciones inexistentes.</w:t>
+      </w:r>
+    </w:p>
+    <w:p>
+      <w:r>
+        <w:t>La delimitación geográfica del caso es el municipio de Monterrey, Nuevo León. El objeto no es el mercado de transporte de toda la entidad ni el conjunto del área metropolitana. La legislación y las competencias institucionales se examinan a escala estatal porque ese es su ámbito de aplicación; esta escala normativa no amplía la unidad de análisis territorial. Los registros de vTaxi considerados deberán referirse al caso delimitado y se identificarán por fecha y versión.</w:t>
       </w:r>
     </w:p>
     <w:p>
@@ -2723,8 +2784,9 @@
         <w:pStyle w:val="Ttulo1"/>
         <w:spacing w:before="120" w:after="80"/>
       </w:pPr>
-      <w:bookmarkStart w:id="14" w:name="_Toc242807303"/>
-      <w:r>
+      <w:bookmarkStart w:id="14" w:name="_Toc243177549"/>
+      <w:r>
+        <w:lastRenderedPageBreak/>
         <w:t>5 Hipótesis de trabajo</w:t>
       </w:r>
       <w:bookmarkEnd w:id="14"/>
@@ -2733,7 +2795,7 @@
       <w:pPr>
         <w:pStyle w:val="Ttulo2"/>
       </w:pPr>
-      <w:bookmarkStart w:id="15" w:name="_Toc242807304"/>
+      <w:bookmarkStart w:id="15" w:name="_Toc243177550"/>
       <w:r>
         <w:t>5.1 Hipótesis general</w:t>
       </w:r>
@@ -2741,7 +2803,7 @@
     </w:p>
     <w:p>
       <w:r>
-        <w:t>HG. En los componentes documentales aplicables al proyecto vTaxi como plataforma de taxis concesionados en Nuevo León durante septiembre a noviembre de 2026, un mayor nivel de gestión del cumplimiento normativo se relaciona con un mayor grado de preparación administrativa del expediente, expresado en documentos completos y coherentes con los requisitos aplicables y en observaciones internas atendidas con respaldo verificable.</w:t>
+        <w:t>HG. En los componentes documentales aplicables al proyecto vTaxi como plataforma de taxis concesionados en Monterrey, Nuevo León durante septiembre a noviembre de 2026, un mayor nivel de gestión del cumplimiento normativo se relaciona con un mayor grado de preparación administrativa del expediente, expresado en documentos completos y coherentes con los requisitos aplicables y en observaciones internas atendidas con respaldo verificable.</w:t>
       </w:r>
     </w:p>
     <w:p>
@@ -2751,127 +2813,100 @@
     </w:p>
     <w:p>
       <w:r>
+        <w:t>La hipótesis deriva de la brecha descrita en antecedentes y planteamiento: los borradores no acreditan una ruta validada entre requisitos, responsables y evidencias. Responde a la pregunta general y al objetivo de analizar esa relación mediante contraste documental. Los antecedentes justifican examinar procedimientos y controles administrativos, pero no demuestran anticipadamente la relación en vTaxi ni permiten trasladar hallazgos de otros contextos como resultados locales.</w:t>
+      </w:r>
+    </w:p>
+    <w:p>
+      <w:r>
+        <w:t>Fundamento metodológico. Hernández Sampieri et al. (2014) definen las hipótesis como “explicaciones tentativas del fenómeno investigado” (p. 104). Por ello, HG es una respuesta provisional a la pregunta general, no una conclusión sobre vTaxi. Los autores vinculan su formulación con problema, antecedentes y marco teórico y exigen variables observables, relaciones precisas y técnicas disponibles para contrastarlas (pp. 105–107). La formulación conserva el caso, periodo y objetos documentales delimitados en los capítulos anteriores.</w:t>
+      </w:r>
+    </w:p>
+    <w:p>
+      <w:r>
         <w:lastRenderedPageBreak/>
-        <w:t>La hipótesis deriva de la brecha descrita en antecedentes y planteamiento: los borradores no acreditan una ruta validada entre requisitos, responsables y evidencias. Responde a la pregunta general y al objetivo de analizar esa relación mediante contraste documental. Los antecedentes justifican examinar procedimientos y controles administrativos, pero no demuestran anticipadamente la relación en vTaxi ni permiten trasladar hallazgos de otros contextos como resultados locales.</w:t>
-      </w:r>
-    </w:p>
-    <w:p>
-      <w:r>
-        <w:t>Fundamento metodológico. Hernández Sampieri et al. (2014) definen las hipótesis como “explicaciones tentativas del fenómeno investigado” (p. 104). Por ello, HG es una respuesta provisional a la pregunta general, no una conclusión sobre vTaxi. Los autores vinculan su formulación con problema, antecedentes y marco teórico y exigen variables observables, relaciones precisas y técnicas disponibles para contrastarlas (pp. 105–107). La formulación conserva el caso, periodo y objetos documentales delimitados en lo</w:t>
-      </w:r>
-      <w:r>
-        <w:t>s capítulos anteriores.</w:t>
-      </w:r>
-    </w:p>
-    <w:p>
-      <w:r>
-        <w:t>Fundamento administrativo. El criterio 8.1 del toolkit de OECD (2018, p. 39) considera relevantes los datos actualizados, la gestión de casos, los registros y los flujos de trabajo para planear y dar seguimiento a la inspección y ejecución regulatoria. Se toma como orientación conceptual sobre trazabilidad, no como norma exigible a vTaxi: su destinatario son estructuras de inspección y supervisión, no plataformas privadas. Su adaptación al caso consiste en examinar responsables identificables, revisión de a</w:t>
-      </w:r>
-      <w:r>
-        <w:t>plicabilidad y seguimiento registrado frente a documentos verificables. Esos controles pueden facilitar la localización de brechas y su revisión, pero un expediente puede permanecer incompleto pese a ellos; de ahí que se proponga una relación contrastable y no un efecto garantizado.</w:t>
-      </w:r>
-    </w:p>
-    <w:p>
-      <w:r>
-        <w:t xml:space="preserve">Enlace con los antecedentes. Parker y Nielsen (2009), incorporados en el capítulo 1 con el alcance limitado de la revisión disponible, plantean el examen de sistemas de cumplimiento y su posible diferencia en la práctica. Ese antecedente y la orientación de OECD justifican investigar controles y evidencia, no dar por acreditada su eficacia. La inferencia de trabajo para vTaxi es propia: donde existen más controles documentados se espera encontrar mayor </w:t>
-      </w:r>
+        <w:t>Fundamento administrativo. El criterio 8.1 del toolkit de OECD (2018, p. 39) considera relevantes los datos actualizados, la gestión de casos, los registros y los flujos de trabajo para planear y dar seguimiento a la inspección y ejecución regulatoria. Se toma como orientación conceptual sobre trazabilidad, no como norma exigible a vTaxi: su destinatario son estructuras de inspección y supervisión, no plataformas privadas. Su adaptación al caso consiste en examinar responsables identificables, revisión de aplicabilidad y seguimiento registrado frente a documentos verificables. Esos controles pueden facilitar la localización de brechas y su revisión, pero un expediente puede permanecer incompleto pese a ellos; de ahí que se proponga una relación contrastable y no un efecto garantizado.</w:t>
+      </w:r>
+    </w:p>
+    <w:p>
+      <w:r>
+        <w:t>Enlace con los antecedentes. Parker y Nielsen (2009), incorporados en el capítulo 1 con el alcance limitado de la revisión disponible, plantean el examen de sistemas de cumplimiento y su posible diferencia en la práctica. Ese antecedente y la orientación de OECD justifican investigar controles y evidencia, no dar por acreditada su eficacia. La inferencia de trabajo para vTaxi es propia: donde existen más controles documentados se espera encontrar mayor preparación del expediente, manteniendo separados los registros de gestión y la evaluación del documento resultante. Las divergencias también se registrarán y podrán debilitar la hipótesis.</w:t>
+      </w:r>
+    </w:p>
+    <w:p>
+      <w:pPr>
+        <w:pStyle w:val="Ttulo2"/>
+      </w:pPr>
+      <w:bookmarkStart w:id="16" w:name="_Toc243177551"/>
+      <w:r>
+        <w:t>5.2 Hipótesis específica</w:t>
+      </w:r>
+      <w:bookmarkEnd w:id="16"/>
+    </w:p>
+    <w:p>
+      <w:r>
+        <w:t>HE1. En los componentes del expediente de vTaxi, la asignación documentada de responsables y el seguimiento de observaciones se relacionan con una mayor proporción de observaciones internas cerradas mediante evidencia documental aceptable en la revisión del caso.</w:t>
+      </w:r>
+    </w:p>
+    <w:p>
+      <w:r>
+        <w:t>Se vincula con la pregunta específica 3 y el objetivo específico 3: examinar la correspondencia entre responsables, verificación y seguimiento, por una parte, e integridad del expediente y resolución de observaciones, por otra. Los objetivos 1 y 2 identifican requisitos y diagnostican brechas; el objetivo 4 propone prioridades. No requieren hipótesis adicionales porque no todos los objetivos descriptivos o propositivos expresan una relación entre variables.</w:t>
+      </w:r>
+    </w:p>
+    <w:p>
+      <w:pPr>
+        <w:pStyle w:val="Ttulo2"/>
+      </w:pPr>
+      <w:bookmarkStart w:id="17" w:name="_Toc243177552"/>
       <w:r>
         <w:lastRenderedPageBreak/>
-        <w:t>preparación del expediente, manteniendo separados los registros de gestión y la evaluación del documento resultante. Las divergencias también se registrarán y podrán debilitar la hipótesis.</w:t>
+        <w:t>5.3 Tipo de hipótesis</w:t>
+      </w:r>
+      <w:bookmarkEnd w:id="17"/>
+    </w:p>
+    <w:p>
+      <w:r>
+        <w:t>HG y HE1 son hipótesis de investigación correlacionales por su contenido relacional, direccionales positivas y no causales. Esto clasifica la proposición, no anuncia un estudio de correlación estadística ya diseñado o ejecutado. El procedimiento previsto para este caso es contraste documental descriptivo por patrones de correspondencia y casos contrarios. No se propone experimento, manipulación, comparación de plataformas ni generalización estadística. Hernández Sampieri et al. (2014) señalan que “Correlación y causalidad son conceptos asociados, pero distintos” (p. 111); encontrar correspondencia no demuestra que la gestión haya producido la preparación del expediente.</w:t>
+      </w:r>
+    </w:p>
+    <w:p>
+      <w:r>
+        <w:t>Convención de variables. Para responder al campo VI–VD de la consigna se identifica X: gestión del cumplimiento, y Y: preparación administrativa del expediente. En la ficha de esta actividad VI se emplea sólo como rótulo de X y VD como rótulo de Y; no se atribuyen causa y efecto. Hernández Sampieri et al. (2014, pp. 109–111) reservan la interpretación independiente/causal y dependiente/efecto para hipótesis causales; Price et al. (2015) también distinguen medición no experimental y causalidad. En el análisis se usarán X e Y y no se interpretará X como variable manipulada.</w:t>
+      </w:r>
+    </w:p>
+    <w:p>
+      <w:r>
+        <w:t>La unidad de análisis es el proyecto vTaxi; los componentes del expediente y las observaciones son unidades de registro internas, no empresas independientes. Se compararán controles y calidad documental en cortes compatibles, sin tratar versiones del mismo documento como nuevos casos. No se calcularán coeficientes, valores p ni niveles de significación: no se ha previsto una prueba inferencial. La ausencia de variación o de datos evaluables impide contrastar, no confirma HG. Cualquier incorporación posterior de un análisis estadístico requeriría justificar previamente diseño, registros suficientes y supuestos; no se presupone en esta tarea.</w:t>
       </w:r>
     </w:p>
     <w:p>
       <w:pPr>
         <w:pStyle w:val="Ttulo2"/>
       </w:pPr>
-      <w:bookmarkStart w:id="16" w:name="_Toc242807305"/>
-      <w:r>
-        <w:t>5.2 Hipótesis específica</w:t>
-      </w:r>
-      <w:bookmarkEnd w:id="16"/>
-    </w:p>
-    <w:p>
-      <w:r>
-        <w:t>HE1. En los componentes del expediente de vTaxi, la asignación documentada de responsables y el seguimiento de observaciones se relacionan con una mayor proporción de observaciones internas cerradas mediante evidencia documental aceptable en la revisión del caso.</w:t>
-      </w:r>
-    </w:p>
-    <w:p>
-      <w:r>
-        <w:t>Se vincula con la pregunta específica 3 y el objetivo específico 3: examinar la correspondencia entre responsables, verificación y seguimiento, por una parte, e integridad del expediente y resolución de observaciones, por otra. Los objetivos 1 y 2 identifican requisitos y diagnostican brechas; el objetivo 4 propone prioridades. No requieren hipótesis adicionales porque no todos los objetivos descriptivos o propositivos expresan una relación entre variables.</w:t>
-      </w:r>
-    </w:p>
-    <w:p>
-      <w:pPr>
-        <w:pStyle w:val="Ttulo2"/>
-      </w:pPr>
-      <w:bookmarkStart w:id="17" w:name="_Toc242807306"/>
-      <w:r>
-        <w:t>5.3 Tipo de hipótesis</w:t>
-      </w:r>
-      <w:bookmarkEnd w:id="17"/>
-    </w:p>
-    <w:p>
-      <w:r>
-        <w:t xml:space="preserve">HG y HE1 son hipótesis de investigación correlacionales por su contenido relacional, direccionales positivas y no causales. Esto clasifica la proposición, no anuncia un estudio de correlación estadística ya diseñado o ejecutado. El </w:t>
-      </w:r>
-      <w:r>
-        <w:t>procedimiento previsto para este caso es contraste documental descriptivo por patrones de correspondencia y casos contrarios. No se propone experimento, manipulación, comparación de plataformas ni generalización estadística. Hernández Sampieri et al. (2014) señalan que “Correlación y causalidad son conceptos asociados, pero distintos” (p. 111); encontrar correspondencia no demuestra que la gestión haya producido la preparación del expediente.</w:t>
-      </w:r>
-    </w:p>
-    <w:p>
-      <w:r>
-        <w:t xml:space="preserve">Convención de variables. Para responder al campo VI–VD de la consigna se identifica X: gestión del cumplimiento, y Y: preparación administrativa del expediente. En la ficha de esta actividad VI se emplea sólo como rótulo de X y VD como rótulo de Y; no se atribuyen causa y efecto. Hernández Sampieri et al. (2014, pp. 109–111) reservan la interpretación independiente/causal y dependiente/efecto para hipótesis causales; Price et al. (2015) también </w:t>
-      </w:r>
+      <w:bookmarkStart w:id="18" w:name="_Toc243177553"/>
       <w:r>
         <w:lastRenderedPageBreak/>
-        <w:t>distinguen medición no experimental y causalidad. En el análisis se usarán X e Y y no se interpretará X como variable manipulada.</w:t>
-      </w:r>
-    </w:p>
-    <w:p>
-      <w:r>
-        <w:t>La unidad de análisis es el proyecto vTaxi; los componentes del expediente y las observaciones son unidades de registro internas, no empresas independientes. Se compararán controles y calidad documental en cortes compatibles, sin tratar versiones del mismo documento como nuevos casos. No se calcularán coeficientes, valores p ni niveles de significación: no se ha previsto una prueba inferencial. La ausencia de variación o de datos evaluables impide contrastar, no confirma HG. Cualquier incorporación posterio</w:t>
-      </w:r>
-      <w:r>
-        <w:t>r de un análisis estadístico requeriría justificar previamente diseño, registros suficientes y supuestos; no se presupone en esta tarea.</w:t>
-      </w:r>
-    </w:p>
-    <w:p>
-      <w:pPr>
-        <w:pStyle w:val="Ttulo2"/>
-      </w:pPr>
-      <w:bookmarkStart w:id="18" w:name="_Toc242807307"/>
-      <w:r>
         <w:t>5.4 Criterios de calidad y contraste documental</w:t>
       </w:r>
       <w:bookmarkEnd w:id="18"/>
     </w:p>
     <w:p>
       <w:r>
-        <w:t>Reglas observables de X e Y. Por componente, X se describirá mediante tres controles comprobables: responsable efectivamente designado, revisión de aplicabilidad fechada y seguimiento documentado; el perfil contará de cero a tres presencias sólo si los tres controles son evaluables. No verificable no se recodifica como ausencia ni entra en ese perfil. Y se observará por separado: proporción de contenidos exigibles presentes, concordancia de cada contenido con el requisito y proporción de observaciones cerra</w:t>
-      </w:r>
-      <w:r>
-        <w:t>das con evidencia aceptable. Se reportarán los indicadores individualmente, sin sumar porcentajes o inventar ponderaciones. Integridad será contenidos exigibles presentes entre contenidos exigibles evaluables; cierre será observaciones cerradas respaldadas entre observaciones evaluables. Con denominador cero se anotará no calculable. La falta de observaciones no prueba integridad. Antes del cotejo se fijarán aplicabilidad y criterios de aceptación; sólo después se examinará si perfiles con más controles coi</w:t>
-      </w:r>
-      <w:r>
-        <w:t>nciden con mejores resultados documentales comparables.</w:t>
-      </w:r>
-    </w:p>
-    <w:p>
-      <w:r>
-        <w:t xml:space="preserve">Claridad. Se diferencian gestión (acciones y registros de control) y preparación (calidad de los documentos resultantes). Se utilizará una ficha por componente con identificador, requisito aplicable, fuente, documento revisado, fecha, versión y limitaciones de acceso. La </w:t>
-      </w:r>
+        <w:t>Reglas observables de X e Y. Por componente, X se describirá mediante tres controles comprobables: responsable efectivamente designado, revisión de aplicabilidad fechada y seguimiento documentado; el perfil contará de cero a tres presencias sólo si los tres controles son evaluables. No verificable no se recodifica como ausencia ni entra en ese perfil. Y se observará por separado: proporción de contenidos exigibles presentes, concordancia de cada contenido con el requisito y proporción de observaciones cerradas con evidencia aceptable. Se reportarán los indicadores individualmente, sin sumar porcentajes o inventar ponderaciones. Integridad será contenidos exigibles presentes entre contenidos exigibles evaluables; cierre será observaciones cerradas respaldadas entre observaciones evaluables. Con denominador cero se anotará no calculable. La falta de observaciones no prueba integridad. Antes del cotejo se fijarán aplicabilidad y criterios de aceptación; sólo después se examinará si perfiles con más controles coinciden con mejores resultados documentales comparables.</w:t>
+      </w:r>
+    </w:p>
+    <w:p>
+      <w:r>
+        <w:t>Claridad. Se diferencian gestión (acciones y registros de control) y preparación (calidad de los documentos resultantes). Se utilizará una ficha por componente con identificador, requisito aplicable, fuente, documento revisado, fecha, versión y limitaciones de acceso. La clasificación previa de taxis concesionados, SETIAP/ERT y capacitación evita atribuir requisitos de otra modalidad a vTaxi.</w:t>
+      </w:r>
+    </w:p>
+    <w:p>
+      <w:r>
+        <w:t>Verificabilidad de la VI. Registrar por separado: responsable documentado (sí/no/no verificable); revisión de aplicabilidad con fuente y fecha (sí/no/no verificable); y seguimiento de acciones u observaciones mediante registro fechado (sí/no/no verificable). Distinguir responsable efectivamente designado de responsable sólo propuesto. La cobertura de cada control será el número de componentes con presencia comprobada dividido entre componentes evaluables; reportar numerador, denominador y casos no verificables. No confundir una recomendación con control ejecutado.</w:t>
+      </w:r>
+    </w:p>
+    <w:p>
       <w:r>
         <w:lastRenderedPageBreak/>
-        <w:t>clasificación previa de taxis concesionados, SETIAP/ERT y capacitación evita atribuir requisitos de otra modalidad a vTaxi.</w:t>
-      </w:r>
-    </w:p>
-    <w:p>
-      <w:r>
-        <w:t>Verificabilidad de la VI. Registrar por separado: responsable documentado (sí/no/no verificable); revisión de aplicabilidad con fuente y fecha (sí/no/no verificable); y seguimiento de acciones u observaciones mediante registro fechado (sí/no/no verificable). Distinguir responsable efectivamente designado de responsable sólo propuesto. La cobertura de cada control será el número de componentes con presencia comprobada dividido entre componentes evaluables; reportar numerador, denominador y casos no verificables. No confundir una recomendación con control ejecutado.</w:t>
-      </w:r>
-    </w:p>
-    <w:p>
-      <w:r>
         <w:t>Verificabilidad de la VD. Una lista distinta registrará integridad de los contenidos exigibles y concordancia del documento con el requisito aplicable, sin puntuar como preparación la mera existencia de responsable o bitácora. Cada observación se clasificará abierta, cerrada con evidencia aceptable o no verificable. La proporción de cierre será observaciones con cierre respaldado entre observaciones evaluables en el mismo corte; informar los conteos. Ausencia de observaciones registradas no equivale a expediente completo ni se divide entre cero.</w:t>
       </w:r>
     </w:p>
@@ -2882,20 +2917,17 @@
     </w:p>
     <w:p>
       <w:r>
-        <w:t xml:space="preserve">Contraste de HG. En una matriz por componente se cotejarán los controles observados con integridad y coherencia documental en el mismo corte. Se buscará el patrón de mejor preparación cuando existen más controles documentados y se revisarán casos contrarios: controles presentes con expediente incompleto, o documentos adecuados sin controles </w:t>
-      </w:r>
+        <w:t>Contraste de HG. En una matriz por componente se cotejarán los controles observados con integridad y coherencia documental en el mismo corte. Se buscará el patrón de mejor preparación cuando existen más controles documentados y se revisarán casos contrarios: controles presentes con expediente incompleto, o documentos adecuados sin controles registrados. Tales casos pueden debilitar o acotar la hipótesis. Si no hay variación, acceso suficiente o criterios comparables, el resultado será no contrastable con la evidencia disponible, no hipótesis confirmada.</w:t>
+      </w:r>
+    </w:p>
+    <w:p>
+      <w:r>
+        <w:t>Contraste de HE1. Por observación se examinarán designación documentada, seguimiento fechado y evidencia de cierre. Se distinguirá el registro de acciones de la corrección verificable del documento. Se atenderán explicaciones alternativas: complejidad del requisito, disponibilidad de información y etapa de elaboración. La correspondencia observada no prueba que los controles hayan causado el cierre. Las relaciones se describirán sólo dentro del caso y con sus limitaciones.</w:t>
+      </w:r>
+    </w:p>
+    <w:p>
       <w:r>
         <w:lastRenderedPageBreak/>
-        <w:t>registrados. Tales casos pueden debilitar o acotar la hipótesis. Si no hay variación, acceso suficiente o criterios comparables, el resultado será no contrastable con la evidencia disponible, no hipótesis confirmada.</w:t>
-      </w:r>
-    </w:p>
-    <w:p>
-      <w:r>
-        <w:t>Contraste de HE1. Por observación se examinarán designación documentada, seguimiento fechado y evidencia de cierre. Se distinguirá el registro de acciones de la corrección verificable del documento. Se atenderán explicaciones alternativas: complejidad del requisito, disponibilidad de información y etapa de elaboración. La correspondencia observada no prueba que los controles hayan causado el cierre. Las relaciones se describirán sólo dentro del caso y con sus limitaciones.</w:t>
-      </w:r>
-    </w:p>
-    <w:p>
-      <w:r>
         <w:t>Pertinencia y consistencia. Las hipótesis responden al problema y objetivos sin sustituirlos ni ampliar el estudio a todas las plataformas. Su interés pertenece a la LGAC Gestión e Innovación de las Organizaciones: procedimientos, responsables, documentos, controles e indicadores. El Círculo de Covey conserva problema y objetivo general en Importante/No urgente; no se agrega la hipótesis al esquema. La clasificación establece una prioridad de planeación, no una prueba de la relación propuesta.</w:t>
       </w:r>
     </w:p>
@@ -2909,9 +2941,8 @@
         <w:pStyle w:val="Ttulo1"/>
         <w:spacing w:before="120" w:after="80"/>
       </w:pPr>
-      <w:bookmarkStart w:id="19" w:name="_Toc242807308"/>
-      <w:r>
-        <w:lastRenderedPageBreak/>
+      <w:bookmarkStart w:id="19" w:name="_Toc243177554"/>
+      <w:r>
         <w:t>6 Alcances y limitaciones</w:t>
       </w:r>
       <w:bookmarkEnd w:id="19"/>
@@ -2921,7 +2952,7 @@
         <w:pStyle w:val="Ttulo2"/>
         <w:spacing w:before="240" w:after="80"/>
       </w:pPr>
-      <w:bookmarkStart w:id="20" w:name="_Toc242807309"/>
+      <w:bookmarkStart w:id="20" w:name="_Toc243177555"/>
       <w:r>
         <w:t>6.1 Alcances</w:t>
       </w:r>
@@ -2932,7 +2963,7 @@
         <w:pStyle w:val="Ttulo2"/>
         <w:spacing w:before="240" w:after="80"/>
       </w:pPr>
-      <w:bookmarkStart w:id="21" w:name="_Toc242807310"/>
+      <w:bookmarkStart w:id="21" w:name="_Toc243177556"/>
       <w:r>
         <w:t>6.2 Limitaciones</w:t>
       </w:r>
@@ -2943,7 +2974,7 @@
         <w:pStyle w:val="Ttulo1"/>
         <w:spacing w:before="120" w:after="80"/>
       </w:pPr>
-      <w:bookmarkStart w:id="22" w:name="_Toc242807311"/>
+      <w:bookmarkStart w:id="22" w:name="_Toc243177557"/>
       <w:r>
         <w:t>7 Marco teórico</w:t>
       </w:r>
@@ -2954,7 +2985,7 @@
         <w:pStyle w:val="Ttulo1"/>
         <w:spacing w:before="120" w:after="80"/>
       </w:pPr>
-      <w:bookmarkStart w:id="23" w:name="_Toc242807312"/>
+      <w:bookmarkStart w:id="23" w:name="_Toc243177558"/>
       <w:r>
         <w:t>8 Métodos o procedimientos</w:t>
       </w:r>
@@ -2966,7 +2997,7 @@
         <w:keepNext w:val="0"/>
         <w:spacing w:before="120" w:after="80"/>
       </w:pPr>
-      <w:bookmarkStart w:id="24" w:name="_Toc242807313"/>
+      <w:bookmarkStart w:id="24" w:name="_Toc243177559"/>
       <w:r>
         <w:t>9 Cronograma de actividades</w:t>
       </w:r>
@@ -2978,7 +3009,7 @@
         <w:pageBreakBefore/>
         <w:spacing w:before="120" w:after="80"/>
       </w:pPr>
-      <w:bookmarkStart w:id="25" w:name="_Toc242807314"/>
+      <w:bookmarkStart w:id="25" w:name="_Toc243177560"/>
       <w:r>
         <w:lastRenderedPageBreak/>
         <w:t>Referencias</w:t>
@@ -3117,6 +3148,24 @@
         <w:ind w:left="720" w:hanging="720"/>
       </w:pPr>
       <w:r>
+        <w:t xml:space="preserve">Lamas Flores, M. S., &amp; Acosta Reveles, I. L. (2025). El cabildeo mediático y en redes sociales como freno a la regulación de plataformas digitales de transporte y reparto en México. </w:t>
+      </w:r>
+      <w:r>
+        <w:rPr>
+          <w:i/>
+        </w:rPr>
+        <w:t>Cuadernos del Ciesal, 2</w:t>
+      </w:r>
+      <w:r>
+        <w:t>(24), 1–28. https://doi.org/10.35305/cc.v2i24.174</w:t>
+      </w:r>
+    </w:p>
+    <w:p>
+      <w:pPr>
+        <w:keepLines/>
+        <w:ind w:left="720" w:hanging="720"/>
+      </w:pPr>
+      <w:r>
         <w:t xml:space="preserve">Melo, I. C., Queiroz, G. A., Alves Junior, P. N., de Sousa, T. B., Yushimito, W. F., &amp; Pereira, J. (2023). Sustainable digital transformation in small and medium enterprises (SMEs): A review on performance. </w:t>
       </w:r>
       <w:r>
@@ -3206,6 +3255,7 @@
         <w:ind w:left="720" w:hanging="720"/>
       </w:pPr>
       <w:r>
+        <w:lastRenderedPageBreak/>
         <w:t xml:space="preserve">Ramírez-Solís, E. R., Llonch-Andreu, J., &amp; Malpica-Romero, A. D. (2022). Relational capital and strategic orientations as antecedents of innovation: Evidence from Mexican SMEs. </w:t>
       </w:r>
       <w:r>
@@ -3224,7 +3274,6 @@
         <w:ind w:left="720" w:hanging="720"/>
       </w:pPr>
       <w:r>
-        <w:lastRenderedPageBreak/>
         <w:t xml:space="preserve">Rodríguez-Espíndola, O., Cuevas-Romo, A., Chowdhury, S., Díaz-Acevedo, N., Albores, P., Despoudi, S., Malesios, C., &amp; Dey, P. K. (2022). The role of circular economy principles and sustainable-oriented innovation to enhance social, economic and environmental performance: Evidence from Mexican SMEs. </w:t>
       </w:r>
       <w:r>
@@ -3333,6 +3382,7 @@
         <w:ind w:left="720" w:hanging="720"/>
       </w:pPr>
       <w:r>
+        <w:lastRenderedPageBreak/>
         <w:t>Instituto Nacional de Estadística y Geografía. (2024). Censos Económicos 2024. https://www.inegi.org.mx/programas/ce/2024/</w:t>
       </w:r>
     </w:p>
@@ -3349,7 +3399,7 @@
         <w:pStyle w:val="Ttulo1"/>
         <w:pageBreakBefore/>
       </w:pPr>
-      <w:bookmarkStart w:id="26" w:name="_Toc242807315"/>
+      <w:bookmarkStart w:id="26" w:name="_Toc243177561"/>
       <w:r>
         <w:lastRenderedPageBreak/>
         <w:t>Anexo 1 Matriz de consistencia</w:t>
@@ -3486,7 +3536,7 @@
               <w:rPr>
                 <w:sz w:val="20"/>
               </w:rPr>
-              <w:t>Gestión del cumplimiento normativo para formalizar vTaxi como plataforma de taxis en Nuevo León</w:t>
+              <w:t>Gestión del cumplimiento normativo para formalizar vTaxi como plataforma de taxis en Monterrey, Nuevo León</w:t>
             </w:r>
             <w:r>
               <w:rPr>
@@ -3499,7 +3549,7 @@
                 <w:sz w:val="20"/>
               </w:rPr>
               <w:br/>
-              <w:t>Los borradores regulatorios de vTaxi no acreditan una ruta validada de requisitos, responsables y evidencias para su formalización como plataforma de taxis concesionados en Nuevo León.</w:t>
+              <w:t>Los borradores regulatorios de vTaxi no acreditan una ruta validada de requisitos, responsables y evidencias para su formalización como plataforma de taxis concesionados en Monterrey, Nuevo León.</w:t>
             </w:r>
           </w:p>
         </w:tc>
@@ -3523,7 +3573,7 @@
               <w:rPr>
                 <w:sz w:val="20"/>
               </w:rPr>
-              <w:t>¿Cómo se relaciona el nivel de gestión del cumplimiento normativo con el grado de preparación administrativa de vTaxi para su formalización como plataforma de taxis concesionados en Nuevo León durante septiembre a noviembre de 2026?</w:t>
+              <w:t>¿Cómo se relaciona el nivel de gestión del cumplimiento normativo con el grado de preparación administrativa de vTaxi para su formalización como plataforma de taxis concesionados en Monterrey, Nuevo León durante septiembre a noviembre de 2026?</w:t>
             </w:r>
           </w:p>
         </w:tc>
@@ -3547,7 +3597,7 @@
               <w:rPr>
                 <w:sz w:val="20"/>
               </w:rPr>
-              <w:t>Analizar la relación entre el nivel de gestión del cumplimiento normativo y el grado de preparación administrativa de vTaxi para su formalización como plataforma de taxis concesionados en Nuevo León durante septiembre a noviembre de 2026, mediante el contraste documental de requisitos, responsabilidades y evidencias del proyecto.</w:t>
+              <w:t>Analizar la relación entre el nivel de gestión del cumplimiento normativo y el grado de preparación administrativa de vTaxi para su formalización como plataforma de taxis concesionados en Monterrey, Nuevo León durante septiembre a noviembre de 2026, mediante el contraste documental de requisitos, responsabilidades y evidencias del proyecto.</w:t>
             </w:r>
           </w:p>
         </w:tc>
@@ -3567,7 +3617,7 @@
             </w:r>
             <w:r>
               <w:br/>
-              <w:t>En los componentes documentales aplicables al proyecto vTaxi como plataforma de taxis concesionados en Nuevo León durante septiembre a noviembre de 2026, un mayor nivel de gestión del cumplimiento normativo se relaciona con un mayor grado de preparación administrativa del expediente, expresado en documentos completos y coherentes con los requisitos aplicables y en observaciones internas atendidas con respaldo verificable.</w:t>
+              <w:t>En los componentes documentales aplicables al proyecto vTaxi como plataforma de taxis concesionados en Monterrey, Nuevo León durante septiembre a noviembre de 2026, un mayor nivel de gestión del cumplimiento normativo se relaciona con un mayor grado de preparación administrativa del expediente, expresado en documentos completos y coherentes con los requisitos aplicables y en observaciones internas atendidas con respaldo verificable.</w:t>
             </w:r>
           </w:p>
         </w:tc>
@@ -3578,7 +3628,7 @@
         <w:pStyle w:val="Ttulo2"/>
         <w:pageBreakBefore/>
       </w:pPr>
-      <w:bookmarkStart w:id="27" w:name="_Toc242807316"/>
+      <w:bookmarkStart w:id="27" w:name="_Toc243177562"/>
       <w:r>
         <w:lastRenderedPageBreak/>
         <w:t>Correspondencia de preguntas y objetivos específicos</w:t>
@@ -4084,7 +4134,7 @@
         <w:pStyle w:val="Ttulo1"/>
         <w:pageBreakBefore/>
       </w:pPr>
-      <w:bookmarkStart w:id="28" w:name="_Toc242807317"/>
+      <w:bookmarkStart w:id="28" w:name="_Toc243177563"/>
       <w:r>
         <w:lastRenderedPageBreak/>
         <w:t>Anexo 2 Círculo de Covey</w:t>
@@ -4246,7 +4296,7 @@
                 <w:sz w:val="20"/>
               </w:rPr>
               <w:br/>
-              <w:t>Los borradores regulatorios de vTaxi no acreditan una ruta validada de requisitos, responsables y evidencias para su formalización como plataforma de taxis concesionados en Nuevo León.</w:t>
+              <w:t>Los borradores regulatorios de vTaxi no acreditan una ruta validada de requisitos, responsables y evidencias para su formalización como plataforma de taxis concesionados en Monterrey, Nuevo León.</w:t>
             </w:r>
             <w:r>
               <w:rPr>
@@ -4266,7 +4316,7 @@
                 <w:sz w:val="20"/>
               </w:rPr>
               <w:br/>
-              <w:t>Analizar la relación entre el nivel de gestión del cumplimiento normativo y el grado de preparación administrativa de vTaxi para su formalización como plataforma de taxis concesionados en Nuevo León durante septiembre a noviembre de 2026, mediante el contraste documental de requisitos, responsabilidades y evidencias del proyecto.</w:t>
+              <w:t>Analizar la relación entre el nivel de gestión del cumplimiento normativo y el grado de preparación administrativa de vTaxi para su formalización como plataforma de taxis concesionados en Monterrey, Nuevo León durante septiembre a noviembre de 2026, mediante el contraste documental de requisitos, responsabilidades y evidencias del proyecto.</w:t>
             </w:r>
           </w:p>
         </w:tc>

</xml_diff>